<commit_message>
Finální kod přesun logu
</commit_message>
<xml_diff>
--- a/Manual_nasazeni_STG_BQ_E9_upraveno.docx
+++ b/Manual_nasazeni_STG_BQ_E9_upraveno.docx
@@ -620,7 +620,15 @@
       </w:r>
       <w:proofErr w:type="spellEnd"/>
       <w:r>
-        <w:t xml:space="preserve"> rozpracované STG joby.</w:t>
+        <w:t xml:space="preserve"> </w:t>
+      </w:r>
+      <w:proofErr w:type="spellStart"/>
+      <w:r>
+        <w:t>rozpracované</w:t>
+      </w:r>
+      <w:proofErr w:type="spellEnd"/>
+      <w:r>
+        <w:t xml:space="preserve"> STG joby.</w:t>
       </w:r>
     </w:p>
     <w:tbl>
@@ -702,9 +710,6 @@
     <w:p>
       <w:pPr>
         <w:pStyle w:val="CodeBlock"/>
-        <w:rPr>
-          <w:rFonts w:hint="eastAsia"/>
-        </w:rPr>
       </w:pPr>
       <w:r>
         <w:t>cd C:\Users\x0577063\scripts\PowerShell</w:t>
@@ -713,9 +718,6 @@
     <w:p>
       <w:pPr>
         <w:pStyle w:val="CodeBlock"/>
-        <w:rPr>
-          <w:rFonts w:hint="eastAsia"/>
-        </w:rPr>
       </w:pPr>
       <w:r>
         <w:t>.\status.ps1</w:t>
@@ -754,9 +756,6 @@
     <w:p>
       <w:pPr>
         <w:pStyle w:val="CodeBlock"/>
-        <w:rPr>
-          <w:rFonts w:hint="eastAsia"/>
-        </w:rPr>
       </w:pPr>
       <w:r>
         <w:t>cd C:\Users\x0577063\scripts\bin</w:t>
@@ -765,9 +764,6 @@
     <w:p>
       <w:pPr>
         <w:pStyle w:val="CodeBlock"/>
-        <w:rPr>
-          <w:rFonts w:hint="eastAsia"/>
-        </w:rPr>
       </w:pPr>
       <w:r>
         <w:t>just web-403</w:t>
@@ -852,9 +848,6 @@
     <w:p>
       <w:pPr>
         <w:pStyle w:val="CodeBlock"/>
-        <w:rPr>
-          <w:rFonts w:hint="eastAsia"/>
-        </w:rPr>
       </w:pPr>
       <w:r>
         <w:t>C:\Users\x0577063\BIDEV-MAIN_o2czep-bq-deploy\pkg</w:t>
@@ -863,9 +856,6 @@
     <w:p>
       <w:pPr>
         <w:pStyle w:val="CodeBlock"/>
-        <w:rPr>
-          <w:rFonts w:hint="eastAsia"/>
-        </w:rPr>
       </w:pPr>
       <w:r>
         <w:t>git pull</w:t>
@@ -874,9 +864,6 @@
     <w:p>
       <w:pPr>
         <w:pStyle w:val="CodeBlock"/>
-        <w:rPr>
-          <w:rFonts w:hint="eastAsia"/>
-        </w:rPr>
       </w:pPr>
       <w:r>
         <w:t>git status</w:t>
@@ -885,9 +872,6 @@
     <w:p>
       <w:pPr>
         <w:pStyle w:val="CodeBlock"/>
-        <w:rPr>
-          <w:rFonts w:hint="eastAsia"/>
-        </w:rPr>
       </w:pPr>
       <w:r>
         <w:t>git push</w:t>
@@ -909,9 +893,6 @@
     <w:p>
       <w:pPr>
         <w:pStyle w:val="CodeBlock"/>
-        <w:rPr>
-          <w:rFonts w:hint="eastAsia"/>
-        </w:rPr>
       </w:pPr>
       <w:r>
         <w:t>cd /d i:\dp\BIDEV-MAIN_o2czep-stg</w:t>
@@ -920,9 +901,6 @@
     <w:p>
       <w:pPr>
         <w:pStyle w:val="CodeBlock"/>
-        <w:rPr>
-          <w:rFonts w:hint="eastAsia"/>
-        </w:rPr>
       </w:pPr>
       <w:r>
         <w:t>git pull</w:t>
@@ -931,9 +909,6 @@
     <w:p>
       <w:pPr>
         <w:pStyle w:val="CodeBlock"/>
-        <w:rPr>
-          <w:rFonts w:hint="eastAsia"/>
-        </w:rPr>
       </w:pPr>
       <w:r>
         <w:t>git log -n3</w:t>
@@ -1028,7 +1003,31 @@
         <w:t xml:space="preserve">☐ </w:t>
       </w:r>
       <w:r>
-        <w:t xml:space="preserve">U nového repozitáře počítat s tím, že založení objektů může </w:t>
+        <w:t xml:space="preserve">U nového repozitáře počítat s tím, že </w:t>
+      </w:r>
+      <w:proofErr w:type="spellStart"/>
+      <w:r>
+        <w:t>založení</w:t>
+      </w:r>
+      <w:proofErr w:type="spellEnd"/>
+      <w:r>
+        <w:t xml:space="preserve"> </w:t>
+      </w:r>
+      <w:proofErr w:type="spellStart"/>
+      <w:r>
+        <w:t>objektů</w:t>
+      </w:r>
+      <w:proofErr w:type="spellEnd"/>
+      <w:r>
+        <w:t xml:space="preserve"> </w:t>
+      </w:r>
+      <w:proofErr w:type="spellStart"/>
+      <w:r>
+        <w:t>může</w:t>
+      </w:r>
+      <w:proofErr w:type="spellEnd"/>
+      <w:r>
+        <w:t xml:space="preserve"> </w:t>
       </w:r>
       <w:proofErr w:type="spellStart"/>
       <w:r>
@@ -1087,9 +1086,6 @@
     <w:p>
       <w:pPr>
         <w:pStyle w:val="CodeBlock"/>
-        <w:rPr>
-          <w:rFonts w:hint="eastAsia"/>
-        </w:rPr>
       </w:pPr>
       <w:r>
         <w:t>cd C:\Users\x0577063\scripts\Proxy_VPN</w:t>
@@ -1098,9 +1094,6 @@
     <w:p>
       <w:pPr>
         <w:pStyle w:val="CodeBlock"/>
-        <w:rPr>
-          <w:rFonts w:hint="eastAsia"/>
-        </w:rPr>
       </w:pPr>
       <w:r>
         <w:t>.\proxy-on.ps1</w:t>
@@ -1109,9 +1102,6 @@
     <w:p>
       <w:pPr>
         <w:pStyle w:val="CodeBlock"/>
-        <w:rPr>
-          <w:rFonts w:hint="eastAsia"/>
-        </w:rPr>
       </w:pPr>
       <w:r>
         <w:t>Get-ChildItem Env:\*proxy*</w:t>
@@ -1169,87 +1159,93 @@
     <w:p>
       <w:pPr>
         <w:pStyle w:val="CodeBlock"/>
-        <w:rPr>
-          <w:rFonts w:hint="eastAsia"/>
-        </w:rPr>
-      </w:pPr>
-      <w:r>
-        <w:t>gcloud auth list</w:t>
+      </w:pPr>
+      <w:proofErr w:type="spellStart"/>
+      <w:r>
+        <w:t>gcloud</w:t>
+      </w:r>
+      <w:proofErr w:type="spellEnd"/>
+      <w:r>
+        <w:t xml:space="preserve"> auth list</w:t>
       </w:r>
     </w:p>
     <w:p>
       <w:pPr>
         <w:pStyle w:val="CodeBlock"/>
-        <w:rPr>
-          <w:rFonts w:hint="eastAsia"/>
-        </w:rPr>
-      </w:pPr>
-      <w:r>
-        <w:t>gcloud config get-value project</w:t>
+      </w:pPr>
+      <w:proofErr w:type="spellStart"/>
+      <w:r>
+        <w:t>gcloud</w:t>
+      </w:r>
+      <w:proofErr w:type="spellEnd"/>
+      <w:r>
+        <w:t xml:space="preserve"> config get-value project</w:t>
+      </w:r>
+    </w:p>
+    <w:p/>
+    <w:p>
+      <w:proofErr w:type="spellStart"/>
+      <w:r>
+        <w:t>Primárně</w:t>
+      </w:r>
+      <w:proofErr w:type="spellEnd"/>
+      <w:r>
+        <w:t xml:space="preserve"> se pro DEV </w:t>
+      </w:r>
+      <w:proofErr w:type="spellStart"/>
+      <w:r>
+        <w:t>používá</w:t>
+      </w:r>
+      <w:proofErr w:type="spellEnd"/>
+      <w:r>
+        <w:t xml:space="preserve"> projekt:</w:t>
       </w:r>
     </w:p>
     <w:p>
-      <w:r>
-        <w:t>Primárně se pro DEV používá projekt:</w:t>
+      <w:pPr>
+        <w:pStyle w:val="CodeBlock"/>
+      </w:pPr>
+      <w:r>
+        <w:t>o2cz-dp-wm-200</w:t>
       </w:r>
     </w:p>
     <w:p>
-      <w:pPr>
-        <w:pStyle w:val="CodeBlock"/>
-        <w:rPr>
-          <w:rFonts w:hint="eastAsia"/>
-        </w:rPr>
-      </w:pPr>
-      <w:r>
-        <w:t>o2cz-dp-wm-200</w:t>
+      <w:r>
+        <w:t>Pokud je potřeba projekt změnit:</w:t>
       </w:r>
     </w:p>
     <w:p>
-      <w:r>
-        <w:t>Pokud je potřeba projekt změnit:</w:t>
+      <w:pPr>
+        <w:pStyle w:val="CodeBlock"/>
+      </w:pPr>
+      <w:r>
+        <w:t>gcloud config set project o2cz-dp-wm-200</w:t>
       </w:r>
     </w:p>
     <w:p>
       <w:pPr>
-        <w:pStyle w:val="CodeBlock"/>
-        <w:rPr>
-          <w:rFonts w:hint="eastAsia"/>
-        </w:rPr>
-      </w:pPr>
-      <w:r>
-        <w:t>gcloud config set project o2cz-dp-wm-200</w:t>
+        <w:pStyle w:val="Nadpis2"/>
+      </w:pPr>
+      <w:r>
+        <w:t>6.3 Spuštění BAT souboru a logování</w:t>
       </w:r>
     </w:p>
     <w:p>
-      <w:pPr>
-        <w:pStyle w:val="Nadpis2"/>
-      </w:pPr>
-      <w:r>
-        <w:t>6.3 Spuštění BAT souboru a logování</w:t>
+      <w:r>
+        <w:t>Přejdu do adresáře aktuálního release a spustím BAT soubor. Výstup ukládám do logu.</w:t>
       </w:r>
     </w:p>
     <w:p>
-      <w:r>
-        <w:t>Přejdu do adresáře aktuálního release a spustím BAT soubor. Výstup ukládám do logu.</w:t>
+      <w:pPr>
+        <w:pStyle w:val="CodeBlock"/>
+      </w:pPr>
+      <w:r>
+        <w:t>cd C:\Users\x0577063\BIDEV-MAIN_o2czep-bq-deploy\pkg</w:t>
       </w:r>
     </w:p>
     <w:p>
       <w:pPr>
         <w:pStyle w:val="CodeBlock"/>
-        <w:rPr>
-          <w:rFonts w:hint="eastAsia"/>
-        </w:rPr>
-      </w:pPr>
-      <w:r>
-        <w:t>cd C:\Users\x0577063\BIDEV-MAIN_o2czep-bq-deploy\pkg</w:t>
-      </w:r>
-    </w:p>
-    <w:p>
-      <w:pPr>
-        <w:pStyle w:val="CodeBlock"/>
-        <w:rPr>
-          <w:rFonts w:hint="eastAsia"/>
-        </w:rPr>
       </w:pPr>
       <w:r>
         <w:t>.\preplach_bq.bat &gt; .\log.log 2&gt;&amp;1</w:t>
@@ -1285,7 +1281,15 @@
           </w:p>
           <w:p>
             <w:r>
-              <w:t xml:space="preserve">Varianta 2&gt;&amp;1 zapíše do logu i chybový výstup. Díky tomu je log </w:t>
+              <w:t xml:space="preserve">Varianta 2&gt;&amp;1 zapíše do logu i chybový výstup. Díky </w:t>
+            </w:r>
+            <w:proofErr w:type="spellStart"/>
+            <w:r>
+              <w:t>tomu</w:t>
+            </w:r>
+            <w:proofErr w:type="spellEnd"/>
+            <w:r>
+              <w:t xml:space="preserve"> je log </w:t>
             </w:r>
             <w:proofErr w:type="spellStart"/>
             <w:r>
@@ -1361,9 +1365,6 @@
     <w:p>
       <w:pPr>
         <w:pStyle w:val="CodeBlock"/>
-        <w:rPr>
-          <w:rFonts w:hint="eastAsia"/>
-        </w:rPr>
       </w:pPr>
       <w:r>
         <w:t>cd C:\Users\x0577063\scripts\Proxy_VPN</w:t>
@@ -1372,9 +1373,6 @@
     <w:p>
       <w:pPr>
         <w:pStyle w:val="CodeBlock"/>
-        <w:rPr>
-          <w:rFonts w:hint="eastAsia"/>
-        </w:rPr>
       </w:pPr>
       <w:r>
         <w:t>.\proxy-on.ps1</w:t>
@@ -1383,9 +1381,6 @@
     <w:p>
       <w:pPr>
         <w:pStyle w:val="CodeBlock"/>
-        <w:rPr>
-          <w:rFonts w:hint="eastAsia"/>
-        </w:rPr>
       </w:pPr>
       <w:r>
         <w:t>cd C:\cesta\k\druhemu\release</w:t>
@@ -1394,9 +1389,6 @@
     <w:p>
       <w:pPr>
         <w:pStyle w:val="CodeBlock"/>
-        <w:rPr>
-          <w:rFonts w:hint="eastAsia"/>
-        </w:rPr>
       </w:pPr>
       <w:r>
         <w:t>.\preplach_bq.bat &gt; .\log_preplach_2.log 2&gt;&amp;1</w:t>
@@ -1434,9 +1426,6 @@
     <w:p>
       <w:pPr>
         <w:pStyle w:val="CodeBlock"/>
-        <w:rPr>
-          <w:rFonts w:hint="eastAsia"/>
-        </w:rPr>
       </w:pPr>
       <w:r>
         <w:t>\\ntinfot404\VIRT_NODE\temp</w:t>
@@ -1452,16 +1441,7 @@
         <w:pStyle w:val="Nadpis2"/>
       </w:pPr>
       <w:r>
-        <w:t>7</w:t>
-      </w:r>
-      <w:r>
-        <w:t>.</w:t>
-      </w:r>
-      <w:r>
-        <w:t>1</w:t>
-      </w:r>
-      <w:r>
-        <w:t xml:space="preserve"> </w:t>
+        <w:t xml:space="preserve">7.1 </w:t>
       </w:r>
       <w:proofErr w:type="spellStart"/>
       <w:r>
@@ -1554,9 +1534,6 @@
     <w:p>
       <w:pPr>
         <w:pStyle w:val="CodeBlock"/>
-        <w:rPr>
-          <w:rFonts w:hint="eastAsia"/>
-        </w:rPr>
       </w:pPr>
       <w:proofErr w:type="spellStart"/>
       <w:r>
@@ -1570,9 +1547,6 @@
     <w:p>
       <w:pPr>
         <w:pStyle w:val="CodeBlock"/>
-        <w:rPr>
-          <w:rFonts w:hint="eastAsia"/>
-        </w:rPr>
       </w:pPr>
       <w:proofErr w:type="spellStart"/>
       <w:r>
@@ -1612,9 +1586,6 @@
     <w:p>
       <w:pPr>
         <w:pStyle w:val="CodeBlock"/>
-        <w:rPr>
-          <w:rFonts w:hint="eastAsia"/>
-        </w:rPr>
       </w:pPr>
       <w:r>
         <w:t>o2cz-dp-wm-200</w:t>
@@ -1657,9 +1628,6 @@
     <w:p>
       <w:pPr>
         <w:pStyle w:val="CodeBlock"/>
-        <w:rPr>
-          <w:rFonts w:hint="eastAsia"/>
-        </w:rPr>
       </w:pPr>
       <w:proofErr w:type="spellStart"/>
       <w:r>
@@ -1743,9 +1711,6 @@
     <w:p>
       <w:pPr>
         <w:pStyle w:val="CodeBlock"/>
-        <w:rPr>
-          <w:rFonts w:hint="eastAsia"/>
-        </w:rPr>
       </w:pPr>
       <w:r>
         <w:t>F:\VIRT_NODE\temp\260630R\bidev-10614-org_and_bscs</w:t>
@@ -1759,9 +1724,6 @@
     <w:p>
       <w:pPr>
         <w:pStyle w:val="CodeBlock"/>
-        <w:rPr>
-          <w:rFonts w:hint="eastAsia"/>
-        </w:rPr>
       </w:pPr>
       <w:r>
         <w:t>preplach_bq.bat &gt; log.log 2&gt;&amp;1</w:t>
@@ -1775,9 +1737,6 @@
     <w:p>
       <w:pPr>
         <w:pStyle w:val="CodeBlock"/>
-        <w:rPr>
-          <w:rFonts w:hint="eastAsia"/>
-        </w:rPr>
       </w:pPr>
       <w:r>
         <w:t>F:\VIRT_NODE\temp\260630R\bidev-10614-org_and_bscs&gt;preplach_bq.bat &gt; log.log 2&gt;&amp;1</w:t>
@@ -1897,7 +1856,15 @@
       </w:r>
       <w:proofErr w:type="spellEnd"/>
       <w:r>
-        <w:t xml:space="preserve"> zpracované tabulky/objekty.</w:t>
+        <w:t xml:space="preserve"> </w:t>
+      </w:r>
+      <w:proofErr w:type="spellStart"/>
+      <w:r>
+        <w:t>zpracované</w:t>
+      </w:r>
+      <w:proofErr w:type="spellEnd"/>
+      <w:r>
+        <w:t xml:space="preserve"> tabulky/objekty.</w:t>
       </w:r>
     </w:p>
     <w:p>
@@ -1932,9 +1899,6 @@
     <w:p>
       <w:pPr>
         <w:pStyle w:val="CodeBlock"/>
-        <w:rPr>
-          <w:rFonts w:hint="eastAsia"/>
-        </w:rPr>
       </w:pPr>
       <w:r>
         <w:t>.\preplach_bq.bat &gt;&gt; .\log.log 2&gt;&amp;1</w:t>
@@ -2574,19 +2538,14 @@
             </w:r>
             <w:proofErr w:type="spellEnd"/>
             <w:r>
-              <w:t xml:space="preserve"> je z </w:t>
+              <w:t xml:space="preserve"> je z</w:t>
+            </w:r>
+            <w:r>
+              <w:t xml:space="preserve">a </w:t>
             </w:r>
             <w:proofErr w:type="spellStart"/>
             <w:r>
-              <w:t>mé</w:t>
-            </w:r>
-            <w:proofErr w:type="spellEnd"/>
-            <w:r>
-              <w:t xml:space="preserve"> </w:t>
-            </w:r>
-            <w:proofErr w:type="spellStart"/>
-            <w:r>
-              <w:t>strany</w:t>
+              <w:t>nás</w:t>
             </w:r>
             <w:proofErr w:type="spellEnd"/>
             <w:r>
@@ -3742,6 +3701,7 @@
   <w:style w:type="character" w:default="1" w:styleId="Standardnpsmoodstavce">
     <w:name w:val="Default Paragraph Font"/>
     <w:uiPriority w:val="1"/>
+    <w:semiHidden/>
     <w:unhideWhenUsed/>
   </w:style>
   <w:style w:type="table" w:default="1" w:styleId="Normlntabulka">

</xml_diff>